<commit_message>
Project 114 Assignment 2
</commit_message>
<xml_diff>
--- a/assignments/Template for FSDI-MDI1 Assignments-1.docx
+++ b/assignments/Template for FSDI-MDI1 Assignments-1.docx
@@ -110,6 +110,15 @@
           <w:rFonts w:ascii="Arial" w:hAnsi="Arial" w:cs="Arial"/>
         </w:rPr>
         <w:t>GitHub Repository Link:</w:t>
+      </w:r>
+      <w:r>
+        <w:t xml:space="preserve"> </w:t>
+      </w:r>
+      <w:r>
+        <w:rPr>
+          <w:rFonts w:ascii="Arial" w:hAnsi="Arial" w:cs="Arial"/>
+        </w:rPr>
+        <w:t>https://github.com/SurgthePro/Project-114-Assignments.git</w:t>
       </w:r>
     </w:p>
     <w:p>
@@ -254,6 +263,55 @@
           <w:rFonts w:ascii="Arial" w:hAnsi="Arial" w:cs="Arial"/>
         </w:rPr>
         <w:t>One validation / error state</w:t>
+      </w:r>
+    </w:p>
+    <w:p>
+      <w:pPr>
+        <w:spacing w:line="360" w:lineRule="auto"/>
+        <w:ind w:left="720"/>
+        <w:rPr>
+          <w:rFonts w:ascii="Arial" w:hAnsi="Arial" w:cs="Arial"/>
+          <w:lang w:val="en-US"/>
+        </w:rPr>
+      </w:pPr>
+      <w:r>
+        <w:rPr>
+          <w:rFonts w:ascii="Arial" w:hAnsi="Arial" w:cs="Arial"/>
+          <w:lang w:val="en-US"/>
+        </w:rPr>
+        <w:t xml:space="preserve">I did not get an error message after I tried to break the code by inserting </w:t>
+      </w:r>
+    </w:p>
+    <w:p>
+      <w:pPr>
+        <w:spacing w:line="360" w:lineRule="auto"/>
+        <w:ind w:left="720"/>
+        <w:rPr>
+          <w:rFonts w:ascii="Arial" w:hAnsi="Arial" w:cs="Arial"/>
+        </w:rPr>
+      </w:pPr>
+      <w:r>
+        <w:rPr>
+          <w:rFonts w:ascii="Arial" w:hAnsi="Arial" w:cs="Arial"/>
+          <w:lang w:val="en-US"/>
+        </w:rPr>
+        <w:t xml:space="preserve">strings instead of integers.  </w:t>
+      </w:r>
+      <w:proofErr w:type="gramStart"/>
+      <w:r>
+        <w:rPr>
+          <w:rFonts w:ascii="Arial" w:hAnsi="Arial" w:cs="Arial"/>
+          <w:lang w:val="en-US"/>
+        </w:rPr>
+        <w:t>Instead</w:t>
+      </w:r>
+      <w:proofErr w:type="gramEnd"/>
+      <w:r>
+        <w:rPr>
+          <w:rFonts w:ascii="Arial" w:hAnsi="Arial" w:cs="Arial"/>
+          <w:lang w:val="en-US"/>
+        </w:rPr>
+        <w:t xml:space="preserve"> Python returned nothing.  </w:t>
       </w:r>
     </w:p>
     <w:p>

</xml_diff>